<commit_message>
LHB-75: Codex round 1: keep the preview address out, Word lists restart
Codex r1 (BLOCK):
- P2: the curl script, its record and the test's example URLs carried the
  preview address. The script now takes it as an argument, the record shows
  <preview>, and the test uses an example branch host.
- P2: the Word checklist numbered every list as one. Each numbered list now
  has its own numbering instance that restarts at 1; links stay links
  (11 lists, 39 hyperlinks read back).
- P3: the README says the /u/ pages answer noindex, follow.
Mutations 6 of 6 red; suite 332 pass, 0 fail, 1 skipped.

Co-Authored-By: Claude Opus 5.5 <noreply@anthropic.com>
</commit_message>
<xml_diff>
--- a/evidence/m7-review-pack/README.docx
+++ b/evidence/m7-review-pack/README.docx
@@ -32,6 +32,10 @@
     <w:p>
       <w:pPr>
         <w:pStyle w:val="ListNumber"/>
+        <w:numPr>
+          <w:ilvl w:val="0"/>
+          <w:numId w:val="10"/>
+        </w:numPr>
       </w:pPr>
       <w:r>
         <w:t>A checklist for Sergio: the English text, the logo, the colors and the intro.</w:t>
@@ -40,6 +44,10 @@
     <w:p>
       <w:pPr>
         <w:pStyle w:val="ListNumber"/>
+        <w:numPr>
+          <w:ilvl w:val="0"/>
+          <w:numId w:val="10"/>
+        </w:numPr>
       </w:pPr>
       <w:r>
         <w:t>Screenshots of 13 screens at three phone and tablet sizes.</w:t>
@@ -48,6 +56,10 @@
     <w:p>
       <w:pPr>
         <w:pStyle w:val="ListNumber"/>
+        <w:numPr>
+          <w:ilvl w:val="0"/>
+          <w:numId w:val="10"/>
+        </w:numPr>
       </w:pPr>
       <w:r>
         <w:t>A device check for the owner: install on iPhone and Android, the screen readers, and offline use.</w:t>
@@ -61,7 +73,7 @@
         <w:t>The preview address comes from the owner.</w:t>
       </w:r>
       <w:r>
-        <w:t xml:space="preserve"> It is not written in this pack. Nothing here is on lahojaboricua.com. The preview is hidden from search engines: every page answers with </w:t>
+        <w:t xml:space="preserve"> It is not written in this pack. Nothing here is on lahojaboricua.com. The preview is hidden from search engines: its pages and files answer with </w:t>
       </w:r>
       <w:r>
         <w:rPr>
@@ -70,7 +82,25 @@
         <w:t>X-Robots-Tag: noindex, nofollow</w:t>
       </w:r>
       <w:r>
-        <w:t>.</w:t>
+        <w:t>. The one exception is the public profile pages (</w:t>
+      </w:r>
+      <w:r>
+        <w:rPr>
+          <w:rFonts w:ascii="Consolas" w:hAnsi="Consolas"/>
+        </w:rPr>
+        <w:t>/u/...</w:t>
+      </w:r>
+      <w:r>
+        <w:t xml:space="preserve">), which are made by the server. They answer </w:t>
+      </w:r>
+      <w:r>
+        <w:rPr>
+          <w:rFonts w:ascii="Consolas" w:hAnsi="Consolas"/>
+        </w:rPr>
+        <w:t>noindex, follow</w:t>
+      </w:r>
+      <w:r>
+        <w:t xml:space="preserve"> on the preview and on the live site alike.</w:t>
       </w:r>
     </w:p>
     <w:p>
@@ -84,6 +114,10 @@
     <w:p>
       <w:pPr>
         <w:pStyle w:val="ListNumber"/>
+        <w:numPr>
+          <w:ilvl w:val="0"/>
+          <w:numId w:val="11"/>
+        </w:numPr>
       </w:pPr>
       <w:r>
         <w:t>The preview database (lhb-preview) has migrations 0001 to 0005, so profiles, People search and the passport work. The project record says they were applied; that was not re-checked on October 29, 2026. Confirm it in the Cloudflare dashboard, or run the check named in LHB-34.</w:t>
@@ -92,6 +126,10 @@
     <w:p>
       <w:pPr>
         <w:pStyle w:val="ListNumber"/>
+        <w:numPr>
+          <w:ilvl w:val="0"/>
+          <w:numId w:val="11"/>
+        </w:numPr>
       </w:pPr>
       <w:r>
         <w:t xml:space="preserve">Sign-in on the preview uses the preview Clerk instance, the same as the earlier previews. A visit with no session answers 401 </w:t>
@@ -118,6 +156,10 @@
     <w:p>
       <w:pPr>
         <w:pStyle w:val="ListNumber"/>
+        <w:numPr>
+          <w:ilvl w:val="0"/>
+          <w:numId w:val="11"/>
+        </w:numPr>
       </w:pPr>
       <w:r>
         <w:t>The intro uses the bus illustration by Calle Pomarrosas. The written permission record for it, and the 3D generator's commercial terms, are preconditions of the release (LHB-77). They are not needed for this review.</w:t>
@@ -161,6 +203,10 @@
     <w:p>
       <w:pPr>
         <w:pStyle w:val="ListNumber"/>
+        <w:numPr>
+          <w:ilvl w:val="0"/>
+          <w:numId w:val="12"/>
+        </w:numPr>
       </w:pPr>
       <w:r>
         <w:t xml:space="preserve">Open </w:t>
@@ -178,6 +224,10 @@
     <w:p>
       <w:pPr>
         <w:pStyle w:val="ListNumber"/>
+        <w:numPr>
+          <w:ilvl w:val="0"/>
+          <w:numId w:val="12"/>
+        </w:numPr>
       </w:pPr>
       <w:r>
         <w:t>For each row: is the English natural and correct, and does it say the same as the Spanish?</w:t>
@@ -186,6 +236,10 @@
     <w:p>
       <w:pPr>
         <w:pStyle w:val="ListNumber"/>
+        <w:numPr>
+          <w:ilvl w:val="0"/>
+          <w:numId w:val="12"/>
+        </w:numPr>
       </w:pPr>
       <w:r>
         <w:t>On the preview, switch to English and open the menu, About, Credits and the passport. Check the texts in place: nothing cut off, nothing left in Spanish.</w:t>
@@ -202,6 +256,10 @@
     <w:p>
       <w:pPr>
         <w:pStyle w:val="ListNumber"/>
+        <w:numPr>
+          <w:ilvl w:val="0"/>
+          <w:numId w:val="13"/>
+        </w:numPr>
       </w:pPr>
       <w:r>
         <w:t xml:space="preserve">Open </w:t>
@@ -246,6 +304,10 @@
     <w:p>
       <w:pPr>
         <w:pStyle w:val="ListNumber"/>
+        <w:numPr>
+          <w:ilvl w:val="0"/>
+          <w:numId w:val="13"/>
+        </w:numPr>
       </w:pPr>
       <w:r>
         <w:t>Which one reads best at 16 px (a browser tab) and at 180 px (the phone's home screen)?</w:t>
@@ -254,6 +316,10 @@
     <w:p>
       <w:pPr>
         <w:pStyle w:val="ListNumber"/>
+        <w:numPr>
+          <w:ilvl w:val="0"/>
+          <w:numId w:val="13"/>
+        </w:numPr>
       </w:pPr>
       <w:r>
         <w:t>The owner makes the final pick (LHB-69). Your comments go to the owner.</w:t>
@@ -270,6 +336,10 @@
     <w:p>
       <w:pPr>
         <w:pStyle w:val="ListNumber"/>
+        <w:numPr>
+          <w:ilvl w:val="0"/>
+          <w:numId w:val="14"/>
+        </w:numPr>
       </w:pPr>
       <w:r>
         <w:t xml:space="preserve">Look at the screenshots </w:t>
@@ -330,6 +400,10 @@
     <w:p>
       <w:pPr>
         <w:pStyle w:val="ListNumber"/>
+        <w:numPr>
+          <w:ilvl w:val="0"/>
+          <w:numId w:val="14"/>
+        </w:numPr>
       </w:pPr>
       <w:r>
         <w:t>Does it feel like La Hoja Boricua? Is anything too loud, too pale, or hard to read?</w:t>
@@ -338,6 +412,10 @@
     <w:p>
       <w:pPr>
         <w:pStyle w:val="ListNumber"/>
+        <w:numPr>
+          <w:ilvl w:val="0"/>
+          <w:numId w:val="14"/>
+        </w:numPr>
       </w:pPr>
       <w:r>
         <w:t>Every text color was measured against its background at 4.5:1 or better (the WCAG AA level). This item is about taste, not legibility.</w:t>
@@ -354,6 +432,10 @@
     <w:p>
       <w:pPr>
         <w:pStyle w:val="ListNumber"/>
+        <w:numPr>
+          <w:ilvl w:val="0"/>
+          <w:numId w:val="15"/>
+        </w:numPr>
       </w:pPr>
       <w:r>
         <w:t xml:space="preserve">It plays the first time someone opens the app (screenshot </w:t>
@@ -389,6 +471,10 @@
     <w:p>
       <w:pPr>
         <w:pStyle w:val="ListNumber"/>
+        <w:numPr>
+          <w:ilvl w:val="0"/>
+          <w:numId w:val="15"/>
+        </w:numPr>
       </w:pPr>
       <w:r>
         <w:t>Check:</w:t>
@@ -452,6 +538,10 @@
     <w:p>
       <w:pPr>
         <w:pStyle w:val="ListNumber"/>
+        <w:numPr>
+          <w:ilvl w:val="0"/>
+          <w:numId w:val="15"/>
+        </w:numPr>
       </w:pPr>
       <w:r>
         <w:rPr>
@@ -475,6 +565,10 @@
     <w:p>
       <w:pPr>
         <w:pStyle w:val="ListNumber"/>
+        <w:numPr>
+          <w:ilvl w:val="0"/>
+          <w:numId w:val="15"/>
+        </w:numPr>
       </w:pPr>
       <w:r>
         <w:t>The intro lasts about six seconds. Is that the right length? Does it fit the brand?</w:t>
@@ -622,9 +716,15 @@
             <w:tcW w:type="dxa" w:w="1728"/>
           </w:tcPr>
           <w:p>
-            <w:r>
-              <w:t>320</w:t>
-            </w:r>
+            <w:hyperlink r:id="rId9">
+              <w:r>
+                <w:rPr>
+                  <w:color w:val="1F5FA8"/>
+                  <w:u w:val="single"/>
+                </w:rPr>
+                <w:t xml:space="preserve">320</w:t>
+              </w:r>
+            </w:hyperlink>
           </w:p>
         </w:tc>
         <w:tc>
@@ -632,9 +732,15 @@
             <w:tcW w:type="dxa" w:w="1728"/>
           </w:tcPr>
           <w:p>
-            <w:r>
-              <w:t>390</w:t>
-            </w:r>
+            <w:hyperlink r:id="rId10">
+              <w:r>
+                <w:rPr>
+                  <w:color w:val="1F5FA8"/>
+                  <w:u w:val="single"/>
+                </w:rPr>
+                <w:t xml:space="preserve">390</w:t>
+              </w:r>
+            </w:hyperlink>
           </w:p>
         </w:tc>
         <w:tc>
@@ -642,9 +748,15 @@
             <w:tcW w:type="dxa" w:w="1728"/>
           </w:tcPr>
           <w:p>
-            <w:r>
-              <w:t>768</w:t>
-            </w:r>
+            <w:hyperlink r:id="rId11">
+              <w:r>
+                <w:rPr>
+                  <w:color w:val="1F5FA8"/>
+                  <w:u w:val="single"/>
+                </w:rPr>
+                <w:t xml:space="preserve">768</w:t>
+              </w:r>
+            </w:hyperlink>
           </w:p>
         </w:tc>
       </w:tr>
@@ -674,9 +786,15 @@
             <w:tcW w:type="dxa" w:w="1728"/>
           </w:tcPr>
           <w:p>
-            <w:r>
-              <w:t>320</w:t>
-            </w:r>
+            <w:hyperlink r:id="rId12">
+              <w:r>
+                <w:rPr>
+                  <w:color w:val="1F5FA8"/>
+                  <w:u w:val="single"/>
+                </w:rPr>
+                <w:t xml:space="preserve">320</w:t>
+              </w:r>
+            </w:hyperlink>
           </w:p>
         </w:tc>
         <w:tc>
@@ -684,9 +802,15 @@
             <w:tcW w:type="dxa" w:w="1728"/>
           </w:tcPr>
           <w:p>
-            <w:r>
-              <w:t>390</w:t>
-            </w:r>
+            <w:hyperlink r:id="rId13">
+              <w:r>
+                <w:rPr>
+                  <w:color w:val="1F5FA8"/>
+                  <w:u w:val="single"/>
+                </w:rPr>
+                <w:t xml:space="preserve">390</w:t>
+              </w:r>
+            </w:hyperlink>
           </w:p>
         </w:tc>
         <w:tc>
@@ -694,9 +818,15 @@
             <w:tcW w:type="dxa" w:w="1728"/>
           </w:tcPr>
           <w:p>
-            <w:r>
-              <w:t>768</w:t>
-            </w:r>
+            <w:hyperlink r:id="rId14">
+              <w:r>
+                <w:rPr>
+                  <w:color w:val="1F5FA8"/>
+                  <w:u w:val="single"/>
+                </w:rPr>
+                <w:t xml:space="preserve">768</w:t>
+              </w:r>
+            </w:hyperlink>
           </w:p>
         </w:tc>
       </w:tr>
@@ -726,9 +856,15 @@
             <w:tcW w:type="dxa" w:w="1728"/>
           </w:tcPr>
           <w:p>
-            <w:r>
-              <w:t>320</w:t>
-            </w:r>
+            <w:hyperlink r:id="rId15">
+              <w:r>
+                <w:rPr>
+                  <w:color w:val="1F5FA8"/>
+                  <w:u w:val="single"/>
+                </w:rPr>
+                <w:t xml:space="preserve">320</w:t>
+              </w:r>
+            </w:hyperlink>
           </w:p>
         </w:tc>
         <w:tc>
@@ -736,9 +872,15 @@
             <w:tcW w:type="dxa" w:w="1728"/>
           </w:tcPr>
           <w:p>
-            <w:r>
-              <w:t>390</w:t>
-            </w:r>
+            <w:hyperlink r:id="rId16">
+              <w:r>
+                <w:rPr>
+                  <w:color w:val="1F5FA8"/>
+                  <w:u w:val="single"/>
+                </w:rPr>
+                <w:t xml:space="preserve">390</w:t>
+              </w:r>
+            </w:hyperlink>
           </w:p>
         </w:tc>
         <w:tc>
@@ -746,9 +888,15 @@
             <w:tcW w:type="dxa" w:w="1728"/>
           </w:tcPr>
           <w:p>
-            <w:r>
-              <w:t>768</w:t>
-            </w:r>
+            <w:hyperlink r:id="rId17">
+              <w:r>
+                <w:rPr>
+                  <w:color w:val="1F5FA8"/>
+                  <w:u w:val="single"/>
+                </w:rPr>
+                <w:t xml:space="preserve">768</w:t>
+              </w:r>
+            </w:hyperlink>
           </w:p>
         </w:tc>
       </w:tr>
@@ -778,9 +926,15 @@
             <w:tcW w:type="dxa" w:w="1728"/>
           </w:tcPr>
           <w:p>
-            <w:r>
-              <w:t>320</w:t>
-            </w:r>
+            <w:hyperlink r:id="rId18">
+              <w:r>
+                <w:rPr>
+                  <w:color w:val="1F5FA8"/>
+                  <w:u w:val="single"/>
+                </w:rPr>
+                <w:t xml:space="preserve">320</w:t>
+              </w:r>
+            </w:hyperlink>
           </w:p>
         </w:tc>
         <w:tc>
@@ -788,9 +942,15 @@
             <w:tcW w:type="dxa" w:w="1728"/>
           </w:tcPr>
           <w:p>
-            <w:r>
-              <w:t>390</w:t>
-            </w:r>
+            <w:hyperlink r:id="rId19">
+              <w:r>
+                <w:rPr>
+                  <w:color w:val="1F5FA8"/>
+                  <w:u w:val="single"/>
+                </w:rPr>
+                <w:t xml:space="preserve">390</w:t>
+              </w:r>
+            </w:hyperlink>
           </w:p>
         </w:tc>
         <w:tc>
@@ -798,9 +958,15 @@
             <w:tcW w:type="dxa" w:w="1728"/>
           </w:tcPr>
           <w:p>
-            <w:r>
-              <w:t>768</w:t>
-            </w:r>
+            <w:hyperlink r:id="rId20">
+              <w:r>
+                <w:rPr>
+                  <w:color w:val="1F5FA8"/>
+                  <w:u w:val="single"/>
+                </w:rPr>
+                <w:t xml:space="preserve">768</w:t>
+              </w:r>
+            </w:hyperlink>
           </w:p>
         </w:tc>
       </w:tr>
@@ -830,9 +996,15 @@
             <w:tcW w:type="dxa" w:w="1728"/>
           </w:tcPr>
           <w:p>
-            <w:r>
-              <w:t>320</w:t>
-            </w:r>
+            <w:hyperlink r:id="rId21">
+              <w:r>
+                <w:rPr>
+                  <w:color w:val="1F5FA8"/>
+                  <w:u w:val="single"/>
+                </w:rPr>
+                <w:t xml:space="preserve">320</w:t>
+              </w:r>
+            </w:hyperlink>
           </w:p>
         </w:tc>
         <w:tc>
@@ -840,9 +1012,15 @@
             <w:tcW w:type="dxa" w:w="1728"/>
           </w:tcPr>
           <w:p>
-            <w:r>
-              <w:t>390</w:t>
-            </w:r>
+            <w:hyperlink r:id="rId22">
+              <w:r>
+                <w:rPr>
+                  <w:color w:val="1F5FA8"/>
+                  <w:u w:val="single"/>
+                </w:rPr>
+                <w:t xml:space="preserve">390</w:t>
+              </w:r>
+            </w:hyperlink>
           </w:p>
         </w:tc>
         <w:tc>
@@ -850,9 +1028,15 @@
             <w:tcW w:type="dxa" w:w="1728"/>
           </w:tcPr>
           <w:p>
-            <w:r>
-              <w:t>768</w:t>
-            </w:r>
+            <w:hyperlink r:id="rId23">
+              <w:r>
+                <w:rPr>
+                  <w:color w:val="1F5FA8"/>
+                  <w:u w:val="single"/>
+                </w:rPr>
+                <w:t xml:space="preserve">768</w:t>
+              </w:r>
+            </w:hyperlink>
           </w:p>
         </w:tc>
       </w:tr>
@@ -882,9 +1066,15 @@
             <w:tcW w:type="dxa" w:w="1728"/>
           </w:tcPr>
           <w:p>
-            <w:r>
-              <w:t>320</w:t>
-            </w:r>
+            <w:hyperlink r:id="rId24">
+              <w:r>
+                <w:rPr>
+                  <w:color w:val="1F5FA8"/>
+                  <w:u w:val="single"/>
+                </w:rPr>
+                <w:t xml:space="preserve">320</w:t>
+              </w:r>
+            </w:hyperlink>
           </w:p>
         </w:tc>
         <w:tc>
@@ -892,9 +1082,15 @@
             <w:tcW w:type="dxa" w:w="1728"/>
           </w:tcPr>
           <w:p>
-            <w:r>
-              <w:t>390</w:t>
-            </w:r>
+            <w:hyperlink r:id="rId25">
+              <w:r>
+                <w:rPr>
+                  <w:color w:val="1F5FA8"/>
+                  <w:u w:val="single"/>
+                </w:rPr>
+                <w:t xml:space="preserve">390</w:t>
+              </w:r>
+            </w:hyperlink>
           </w:p>
         </w:tc>
         <w:tc>
@@ -902,9 +1098,15 @@
             <w:tcW w:type="dxa" w:w="1728"/>
           </w:tcPr>
           <w:p>
-            <w:r>
-              <w:t>768</w:t>
-            </w:r>
+            <w:hyperlink r:id="rId26">
+              <w:r>
+                <w:rPr>
+                  <w:color w:val="1F5FA8"/>
+                  <w:u w:val="single"/>
+                </w:rPr>
+                <w:t xml:space="preserve">768</w:t>
+              </w:r>
+            </w:hyperlink>
           </w:p>
         </w:tc>
       </w:tr>
@@ -934,9 +1136,15 @@
             <w:tcW w:type="dxa" w:w="1728"/>
           </w:tcPr>
           <w:p>
-            <w:r>
-              <w:t>320</w:t>
-            </w:r>
+            <w:hyperlink r:id="rId27">
+              <w:r>
+                <w:rPr>
+                  <w:color w:val="1F5FA8"/>
+                  <w:u w:val="single"/>
+                </w:rPr>
+                <w:t xml:space="preserve">320</w:t>
+              </w:r>
+            </w:hyperlink>
           </w:p>
         </w:tc>
         <w:tc>
@@ -944,9 +1152,15 @@
             <w:tcW w:type="dxa" w:w="1728"/>
           </w:tcPr>
           <w:p>
-            <w:r>
-              <w:t>390</w:t>
-            </w:r>
+            <w:hyperlink r:id="rId28">
+              <w:r>
+                <w:rPr>
+                  <w:color w:val="1F5FA8"/>
+                  <w:u w:val="single"/>
+                </w:rPr>
+                <w:t xml:space="preserve">390</w:t>
+              </w:r>
+            </w:hyperlink>
           </w:p>
         </w:tc>
         <w:tc>
@@ -954,9 +1168,15 @@
             <w:tcW w:type="dxa" w:w="1728"/>
           </w:tcPr>
           <w:p>
-            <w:r>
-              <w:t>768</w:t>
-            </w:r>
+            <w:hyperlink r:id="rId29">
+              <w:r>
+                <w:rPr>
+                  <w:color w:val="1F5FA8"/>
+                  <w:u w:val="single"/>
+                </w:rPr>
+                <w:t xml:space="preserve">768</w:t>
+              </w:r>
+            </w:hyperlink>
           </w:p>
         </w:tc>
       </w:tr>
@@ -986,9 +1206,15 @@
             <w:tcW w:type="dxa" w:w="1728"/>
           </w:tcPr>
           <w:p>
-            <w:r>
-              <w:t>320</w:t>
-            </w:r>
+            <w:hyperlink r:id="rId30">
+              <w:r>
+                <w:rPr>
+                  <w:color w:val="1F5FA8"/>
+                  <w:u w:val="single"/>
+                </w:rPr>
+                <w:t xml:space="preserve">320</w:t>
+              </w:r>
+            </w:hyperlink>
           </w:p>
         </w:tc>
         <w:tc>
@@ -996,9 +1222,15 @@
             <w:tcW w:type="dxa" w:w="1728"/>
           </w:tcPr>
           <w:p>
-            <w:r>
-              <w:t>390</w:t>
-            </w:r>
+            <w:hyperlink r:id="rId31">
+              <w:r>
+                <w:rPr>
+                  <w:color w:val="1F5FA8"/>
+                  <w:u w:val="single"/>
+                </w:rPr>
+                <w:t xml:space="preserve">390</w:t>
+              </w:r>
+            </w:hyperlink>
           </w:p>
         </w:tc>
         <w:tc>
@@ -1006,9 +1238,15 @@
             <w:tcW w:type="dxa" w:w="1728"/>
           </w:tcPr>
           <w:p>
-            <w:r>
-              <w:t>768</w:t>
-            </w:r>
+            <w:hyperlink r:id="rId32">
+              <w:r>
+                <w:rPr>
+                  <w:color w:val="1F5FA8"/>
+                  <w:u w:val="single"/>
+                </w:rPr>
+                <w:t xml:space="preserve">768</w:t>
+              </w:r>
+            </w:hyperlink>
           </w:p>
         </w:tc>
       </w:tr>
@@ -1038,9 +1276,15 @@
             <w:tcW w:type="dxa" w:w="1728"/>
           </w:tcPr>
           <w:p>
-            <w:r>
-              <w:t>320</w:t>
-            </w:r>
+            <w:hyperlink r:id="rId33">
+              <w:r>
+                <w:rPr>
+                  <w:color w:val="1F5FA8"/>
+                  <w:u w:val="single"/>
+                </w:rPr>
+                <w:t xml:space="preserve">320</w:t>
+              </w:r>
+            </w:hyperlink>
           </w:p>
         </w:tc>
         <w:tc>
@@ -1048,9 +1292,15 @@
             <w:tcW w:type="dxa" w:w="1728"/>
           </w:tcPr>
           <w:p>
-            <w:r>
-              <w:t>390</w:t>
-            </w:r>
+            <w:hyperlink r:id="rId34">
+              <w:r>
+                <w:rPr>
+                  <w:color w:val="1F5FA8"/>
+                  <w:u w:val="single"/>
+                </w:rPr>
+                <w:t xml:space="preserve">390</w:t>
+              </w:r>
+            </w:hyperlink>
           </w:p>
         </w:tc>
         <w:tc>
@@ -1058,9 +1308,15 @@
             <w:tcW w:type="dxa" w:w="1728"/>
           </w:tcPr>
           <w:p>
-            <w:r>
-              <w:t>768</w:t>
-            </w:r>
+            <w:hyperlink r:id="rId35">
+              <w:r>
+                <w:rPr>
+                  <w:color w:val="1F5FA8"/>
+                  <w:u w:val="single"/>
+                </w:rPr>
+                <w:t xml:space="preserve">768</w:t>
+              </w:r>
+            </w:hyperlink>
           </w:p>
         </w:tc>
       </w:tr>
@@ -1090,9 +1346,15 @@
             <w:tcW w:type="dxa" w:w="1728"/>
           </w:tcPr>
           <w:p>
-            <w:r>
-              <w:t>320</w:t>
-            </w:r>
+            <w:hyperlink r:id="rId36">
+              <w:r>
+                <w:rPr>
+                  <w:color w:val="1F5FA8"/>
+                  <w:u w:val="single"/>
+                </w:rPr>
+                <w:t xml:space="preserve">320</w:t>
+              </w:r>
+            </w:hyperlink>
           </w:p>
         </w:tc>
         <w:tc>
@@ -1100,9 +1362,15 @@
             <w:tcW w:type="dxa" w:w="1728"/>
           </w:tcPr>
           <w:p>
-            <w:r>
-              <w:t>390</w:t>
-            </w:r>
+            <w:hyperlink r:id="rId37">
+              <w:r>
+                <w:rPr>
+                  <w:color w:val="1F5FA8"/>
+                  <w:u w:val="single"/>
+                </w:rPr>
+                <w:t xml:space="preserve">390</w:t>
+              </w:r>
+            </w:hyperlink>
           </w:p>
         </w:tc>
         <w:tc>
@@ -1110,9 +1378,15 @@
             <w:tcW w:type="dxa" w:w="1728"/>
           </w:tcPr>
           <w:p>
-            <w:r>
-              <w:t>768</w:t>
-            </w:r>
+            <w:hyperlink r:id="rId38">
+              <w:r>
+                <w:rPr>
+                  <w:color w:val="1F5FA8"/>
+                  <w:u w:val="single"/>
+                </w:rPr>
+                <w:t xml:space="preserve">768</w:t>
+              </w:r>
+            </w:hyperlink>
           </w:p>
         </w:tc>
       </w:tr>
@@ -1142,9 +1416,15 @@
             <w:tcW w:type="dxa" w:w="1728"/>
           </w:tcPr>
           <w:p>
-            <w:r>
-              <w:t>320</w:t>
-            </w:r>
+            <w:hyperlink r:id="rId39">
+              <w:r>
+                <w:rPr>
+                  <w:color w:val="1F5FA8"/>
+                  <w:u w:val="single"/>
+                </w:rPr>
+                <w:t xml:space="preserve">320</w:t>
+              </w:r>
+            </w:hyperlink>
           </w:p>
         </w:tc>
         <w:tc>
@@ -1152,9 +1432,15 @@
             <w:tcW w:type="dxa" w:w="1728"/>
           </w:tcPr>
           <w:p>
-            <w:r>
-              <w:t>390</w:t>
-            </w:r>
+            <w:hyperlink r:id="rId40">
+              <w:r>
+                <w:rPr>
+                  <w:color w:val="1F5FA8"/>
+                  <w:u w:val="single"/>
+                </w:rPr>
+                <w:t xml:space="preserve">390</w:t>
+              </w:r>
+            </w:hyperlink>
           </w:p>
         </w:tc>
         <w:tc>
@@ -1162,9 +1448,15 @@
             <w:tcW w:type="dxa" w:w="1728"/>
           </w:tcPr>
           <w:p>
-            <w:r>
-              <w:t>768</w:t>
-            </w:r>
+            <w:hyperlink r:id="rId41">
+              <w:r>
+                <w:rPr>
+                  <w:color w:val="1F5FA8"/>
+                  <w:u w:val="single"/>
+                </w:rPr>
+                <w:t xml:space="preserve">768</w:t>
+              </w:r>
+            </w:hyperlink>
           </w:p>
         </w:tc>
       </w:tr>
@@ -1194,9 +1486,15 @@
             <w:tcW w:type="dxa" w:w="1728"/>
           </w:tcPr>
           <w:p>
-            <w:r>
-              <w:t>320</w:t>
-            </w:r>
+            <w:hyperlink r:id="rId42">
+              <w:r>
+                <w:rPr>
+                  <w:color w:val="1F5FA8"/>
+                  <w:u w:val="single"/>
+                </w:rPr>
+                <w:t xml:space="preserve">320</w:t>
+              </w:r>
+            </w:hyperlink>
           </w:p>
         </w:tc>
         <w:tc>
@@ -1204,9 +1502,15 @@
             <w:tcW w:type="dxa" w:w="1728"/>
           </w:tcPr>
           <w:p>
-            <w:r>
-              <w:t>390</w:t>
-            </w:r>
+            <w:hyperlink r:id="rId43">
+              <w:r>
+                <w:rPr>
+                  <w:color w:val="1F5FA8"/>
+                  <w:u w:val="single"/>
+                </w:rPr>
+                <w:t xml:space="preserve">390</w:t>
+              </w:r>
+            </w:hyperlink>
           </w:p>
         </w:tc>
         <w:tc>
@@ -1214,9 +1518,15 @@
             <w:tcW w:type="dxa" w:w="1728"/>
           </w:tcPr>
           <w:p>
-            <w:r>
-              <w:t>768</w:t>
-            </w:r>
+            <w:hyperlink r:id="rId44">
+              <w:r>
+                <w:rPr>
+                  <w:color w:val="1F5FA8"/>
+                  <w:u w:val="single"/>
+                </w:rPr>
+                <w:t xml:space="preserve">768</w:t>
+              </w:r>
+            </w:hyperlink>
           </w:p>
         </w:tc>
       </w:tr>
@@ -1246,9 +1556,15 @@
             <w:tcW w:type="dxa" w:w="1728"/>
           </w:tcPr>
           <w:p>
-            <w:r>
-              <w:t>320</w:t>
-            </w:r>
+            <w:hyperlink r:id="rId45">
+              <w:r>
+                <w:rPr>
+                  <w:color w:val="1F5FA8"/>
+                  <w:u w:val="single"/>
+                </w:rPr>
+                <w:t xml:space="preserve">320</w:t>
+              </w:r>
+            </w:hyperlink>
           </w:p>
         </w:tc>
         <w:tc>
@@ -1256,9 +1572,15 @@
             <w:tcW w:type="dxa" w:w="1728"/>
           </w:tcPr>
           <w:p>
-            <w:r>
-              <w:t>390</w:t>
-            </w:r>
+            <w:hyperlink r:id="rId46">
+              <w:r>
+                <w:rPr>
+                  <w:color w:val="1F5FA8"/>
+                  <w:u w:val="single"/>
+                </w:rPr>
+                <w:t xml:space="preserve">390</w:t>
+              </w:r>
+            </w:hyperlink>
           </w:p>
         </w:tc>
         <w:tc>
@@ -1266,9 +1588,15 @@
             <w:tcW w:type="dxa" w:w="1728"/>
           </w:tcPr>
           <w:p>
-            <w:r>
-              <w:t>768</w:t>
-            </w:r>
+            <w:hyperlink r:id="rId47">
+              <w:r>
+                <w:rPr>
+                  <w:color w:val="1F5FA8"/>
+                  <w:u w:val="single"/>
+                </w:rPr>
+                <w:t xml:space="preserve">768</w:t>
+              </w:r>
+            </w:hyperlink>
           </w:p>
         </w:tc>
       </w:tr>
@@ -1297,6 +1625,10 @@
     <w:p>
       <w:pPr>
         <w:pStyle w:val="ListNumber"/>
+        <w:numPr>
+          <w:ilvl w:val="0"/>
+          <w:numId w:val="16"/>
+        </w:numPr>
       </w:pPr>
       <w:r>
         <w:t>Open Safari and go to the preview address.</w:t>
@@ -1305,6 +1637,10 @@
     <w:p>
       <w:pPr>
         <w:pStyle w:val="ListNumber"/>
+        <w:numPr>
+          <w:ilvl w:val="0"/>
+          <w:numId w:val="16"/>
+        </w:numPr>
       </w:pPr>
       <w:r>
         <w:t xml:space="preserve">Wait for the intro. It should play muted and close by itself, or close when you tap </w:t>
@@ -1331,6 +1667,10 @@
     <w:p>
       <w:pPr>
         <w:pStyle w:val="ListNumber"/>
+        <w:numPr>
+          <w:ilvl w:val="0"/>
+          <w:numId w:val="16"/>
+        </w:numPr>
       </w:pPr>
       <w:r>
         <w:t xml:space="preserve">Tap the </w:t>
@@ -1366,6 +1706,10 @@
     <w:p>
       <w:pPr>
         <w:pStyle w:val="ListNumber"/>
+        <w:numPr>
+          <w:ilvl w:val="0"/>
+          <w:numId w:val="16"/>
+        </w:numPr>
       </w:pPr>
       <w:r>
         <w:t>Close Safari. Open La Hoja Boricua from the home screen. It opens full screen, with no Safari bar.</w:t>
@@ -1374,6 +1718,10 @@
     <w:p>
       <w:pPr>
         <w:pStyle w:val="ListNumber"/>
+        <w:numPr>
+          <w:ilvl w:val="0"/>
+          <w:numId w:val="16"/>
+        </w:numPr>
       </w:pPr>
       <w:r>
         <w:t xml:space="preserve">Sign in. Open </w:t>
@@ -1408,6 +1756,10 @@
     <w:p>
       <w:pPr>
         <w:pStyle w:val="ListNumber"/>
+        <w:numPr>
+          <w:ilvl w:val="0"/>
+          <w:numId w:val="17"/>
+        </w:numPr>
       </w:pPr>
       <w:r>
         <w:t xml:space="preserve">Open </w:t>
@@ -1443,6 +1795,10 @@
     <w:p>
       <w:pPr>
         <w:pStyle w:val="ListNumber"/>
+        <w:numPr>
+          <w:ilvl w:val="0"/>
+          <w:numId w:val="17"/>
+        </w:numPr>
       </w:pPr>
       <w:r>
         <w:t>Open the app from the home screen. VoiceOver should read the page title, then each card's name.</w:t>
@@ -1451,6 +1807,10 @@
     <w:p>
       <w:pPr>
         <w:pStyle w:val="ListNumber"/>
+        <w:numPr>
+          <w:ilvl w:val="0"/>
+          <w:numId w:val="17"/>
+        </w:numPr>
       </w:pPr>
       <w:r>
         <w:t>Open the menu. Each item is read with its name, and the current page is announced as current.</w:t>
@@ -1459,6 +1819,10 @@
     <w:p>
       <w:pPr>
         <w:pStyle w:val="ListNumber"/>
+        <w:numPr>
+          <w:ilvl w:val="0"/>
+          <w:numId w:val="17"/>
+        </w:numPr>
       </w:pPr>
       <w:r>
         <w:t xml:space="preserve">Open </w:t>
@@ -1476,6 +1840,10 @@
     <w:p>
       <w:pPr>
         <w:pStyle w:val="ListNumber"/>
+        <w:numPr>
+          <w:ilvl w:val="0"/>
+          <w:numId w:val="17"/>
+        </w:numPr>
       </w:pPr>
       <w:r>
         <w:t xml:space="preserve">In </w:t>
@@ -1520,6 +1888,10 @@
     <w:p>
       <w:pPr>
         <w:pStyle w:val="ListNumber"/>
+        <w:numPr>
+          <w:ilvl w:val="0"/>
+          <w:numId w:val="17"/>
+        </w:numPr>
       </w:pPr>
       <w:r>
         <w:t>Turn VoiceOver and Reduce Motion back off.</w:t>
@@ -1536,6 +1908,10 @@
     <w:p>
       <w:pPr>
         <w:pStyle w:val="ListNumber"/>
+        <w:numPr>
+          <w:ilvl w:val="0"/>
+          <w:numId w:val="18"/>
+        </w:numPr>
       </w:pPr>
       <w:r>
         <w:t>Open Chrome and go to the preview address. Wait for the intro.</w:t>
@@ -1544,6 +1920,10 @@
     <w:p>
       <w:pPr>
         <w:pStyle w:val="ListNumber"/>
+        <w:numPr>
+          <w:ilvl w:val="0"/>
+          <w:numId w:val="18"/>
+        </w:numPr>
       </w:pPr>
       <w:r>
         <w:t xml:space="preserve">Tap the three-dot menu, tap </w:t>
@@ -1579,6 +1959,10 @@
     <w:p>
       <w:pPr>
         <w:pStyle w:val="ListNumber"/>
+        <w:numPr>
+          <w:ilvl w:val="0"/>
+          <w:numId w:val="18"/>
+        </w:numPr>
       </w:pPr>
       <w:r>
         <w:t>Open the app from the home screen. It opens full screen, with no Chrome bar.</w:t>
@@ -1587,6 +1971,10 @@
     <w:p>
       <w:pPr>
         <w:pStyle w:val="ListNumber"/>
+        <w:numPr>
+          <w:ilvl w:val="0"/>
+          <w:numId w:val="18"/>
+        </w:numPr>
       </w:pPr>
       <w:r>
         <w:t xml:space="preserve">Sign in. Open </w:t>
@@ -1621,6 +2009,10 @@
     <w:p>
       <w:pPr>
         <w:pStyle w:val="ListNumber"/>
+        <w:numPr>
+          <w:ilvl w:val="0"/>
+          <w:numId w:val="19"/>
+        </w:numPr>
       </w:pPr>
       <w:r>
         <w:t xml:space="preserve">Open </w:t>
@@ -1656,6 +2048,10 @@
     <w:p>
       <w:pPr>
         <w:pStyle w:val="ListNumber"/>
+        <w:numPr>
+          <w:ilvl w:val="0"/>
+          <w:numId w:val="19"/>
+        </w:numPr>
       </w:pPr>
       <w:r>
         <w:t>Repeat steps 2 to 4 of the VoiceOver list.</w:t>
@@ -1664,6 +2060,10 @@
     <w:p>
       <w:pPr>
         <w:pStyle w:val="ListNumber"/>
+        <w:numPr>
+          <w:ilvl w:val="0"/>
+          <w:numId w:val="19"/>
+        </w:numPr>
       </w:pPr>
       <w:r>
         <w:t>Turn TalkBack off: press and hold both volume keys for three seconds.</w:t>
@@ -1680,6 +2080,10 @@
     <w:p>
       <w:pPr>
         <w:pStyle w:val="ListNumber"/>
+        <w:numPr>
+          <w:ilvl w:val="0"/>
+          <w:numId w:val="20"/>
+        </w:numPr>
       </w:pPr>
       <w:r>
         <w:t>Open the installed app once while online and visit the catalog, a cigar and the passport.</w:t>
@@ -1688,6 +2092,10 @@
     <w:p>
       <w:pPr>
         <w:pStyle w:val="ListNumber"/>
+        <w:numPr>
+          <w:ilvl w:val="0"/>
+          <w:numId w:val="20"/>
+        </w:numPr>
       </w:pPr>
       <w:r>
         <w:t>Turn on airplane mode.</w:t>
@@ -1696,6 +2104,10 @@
     <w:p>
       <w:pPr>
         <w:pStyle w:val="ListNumber"/>
+        <w:numPr>
+          <w:ilvl w:val="0"/>
+          <w:numId w:val="20"/>
+        </w:numPr>
       </w:pPr>
       <w:r>
         <w:t>Close the app fully, then open it again. The catalog, the cigar pages you opened and your passport still show.</w:t>
@@ -1704,6 +2116,10 @@
     <w:p>
       <w:pPr>
         <w:pStyle w:val="ListNumber"/>
+        <w:numPr>
+          <w:ilvl w:val="0"/>
+          <w:numId w:val="20"/>
+        </w:numPr>
       </w:pPr>
       <w:r>
         <w:t>Stamp a cigar while offline. It stamps on the phone.</w:t>
@@ -1712,6 +2128,10 @@
     <w:p>
       <w:pPr>
         <w:pStyle w:val="ListNumber"/>
+        <w:numPr>
+          <w:ilvl w:val="0"/>
+          <w:numId w:val="20"/>
+        </w:numPr>
       </w:pPr>
       <w:r>
         <w:t>Turn airplane mode off and wait a minute. The stamp is saved to your account: open the app on another device or browser and check that it is there.</w:t>
@@ -2039,6 +2459,72 @@
   </w:num>
   <w:num w:numId="9">
     <w:abstractNumId w:val="0"/>
+  </w:num>
+  <w:num w:numId="10">
+    <w:abstractNumId w:val="7"/>
+    <w:lvlOverride w:ilvl="0">
+      <w:startOverride w:val="1"/>
+    </w:lvlOverride>
+  </w:num>
+  <w:num w:numId="11">
+    <w:abstractNumId w:val="7"/>
+    <w:lvlOverride w:ilvl="0">
+      <w:startOverride w:val="1"/>
+    </w:lvlOverride>
+  </w:num>
+  <w:num w:numId="12">
+    <w:abstractNumId w:val="7"/>
+    <w:lvlOverride w:ilvl="0">
+      <w:startOverride w:val="1"/>
+    </w:lvlOverride>
+  </w:num>
+  <w:num w:numId="13">
+    <w:abstractNumId w:val="7"/>
+    <w:lvlOverride w:ilvl="0">
+      <w:startOverride w:val="1"/>
+    </w:lvlOverride>
+  </w:num>
+  <w:num w:numId="14">
+    <w:abstractNumId w:val="7"/>
+    <w:lvlOverride w:ilvl="0">
+      <w:startOverride w:val="1"/>
+    </w:lvlOverride>
+  </w:num>
+  <w:num w:numId="15">
+    <w:abstractNumId w:val="7"/>
+    <w:lvlOverride w:ilvl="0">
+      <w:startOverride w:val="1"/>
+    </w:lvlOverride>
+  </w:num>
+  <w:num w:numId="16">
+    <w:abstractNumId w:val="7"/>
+    <w:lvlOverride w:ilvl="0">
+      <w:startOverride w:val="1"/>
+    </w:lvlOverride>
+  </w:num>
+  <w:num w:numId="17">
+    <w:abstractNumId w:val="7"/>
+    <w:lvlOverride w:ilvl="0">
+      <w:startOverride w:val="1"/>
+    </w:lvlOverride>
+  </w:num>
+  <w:num w:numId="18">
+    <w:abstractNumId w:val="7"/>
+    <w:lvlOverride w:ilvl="0">
+      <w:startOverride w:val="1"/>
+    </w:lvlOverride>
+  </w:num>
+  <w:num w:numId="19">
+    <w:abstractNumId w:val="7"/>
+    <w:lvlOverride w:ilvl="0">
+      <w:startOverride w:val="1"/>
+    </w:lvlOverride>
+  </w:num>
+  <w:num w:numId="20">
+    <w:abstractNumId w:val="7"/>
+    <w:lvlOverride w:ilvl="0">
+      <w:startOverride w:val="1"/>
+    </w:lvlOverride>
   </w:num>
 </w:numbering>
 </file>

</xml_diff>